<commit_message>
vault backup: 2026-07-25 00:18:54
</commit_message>
<xml_diff>
--- a/00.raw-materials/90.processed/LithoAutoPiRun/LithoAutoPiRun_复杂逻辑流程图.docx
+++ b/00.raw-materials/90.processed/LithoAutoPiRun/LithoAutoPiRun_复杂逻辑流程图.docx
@@ -11,7 +11,7 @@
         <w:rPr>
           <w:rFonts w:ascii="Calibri" w:hAnsi="Calibri" w:eastAsia="Microsoft YaHei"/>
           <w:b/>
-          <w:color w:val="2E74B5"/>
+          <w:color w:val="111827"/>
           <w:sz w:val="34"/>
         </w:rPr>
         <w:t>流程图 1：RTD 候选筛选与 Pilot 选择</w:t>
@@ -25,7 +25,7 @@
       <w:r>
         <w:rPr>
           <w:rFonts w:ascii="Calibri" w:hAnsi="Calibri" w:eastAsia="Microsoft YaHei"/>
-          <w:color w:val="667085"/>
+          <w:color w:val="111827"/>
           <w:sz w:val="19"/>
         </w:rPr>
         <w:t>展示 Lot 获取、基础条件过滤、候选排序与 Pilot 选定的完整判断链路。</w:t>
@@ -49,7 +49,7 @@
       <w:r>
         <w:drawing>
           <wp:inline xmlns:a="http://schemas.openxmlformats.org/drawingml/2006/main" xmlns:pic="http://schemas.openxmlformats.org/drawingml/2006/picture">
-            <wp:extent cx="5074920" cy="6202680"/>
+            <wp:extent cx="5623560" cy="6560820"/>
             <wp:docPr id="1" name="Picture 1" descr="流程图 1：RTD 候选筛选与 Pilot 选择。展示 Lot 获取、基础条件过滤、候选排序与 Pilot 选定的完整判断链路。" title="复杂逻辑流程图（按最终确认规则整理）"/>
             <wp:cNvGraphicFramePr>
               <a:graphicFrameLocks noChangeAspect="1"/>
@@ -70,7 +70,7 @@
                   <pic:spPr>
                     <a:xfrm>
                       <a:off x="0" y="0"/>
-                      <a:ext cx="5074920" cy="6202680"/>
+                      <a:ext cx="5623560" cy="6560820"/>
                     </a:xfrm>
                     <a:prstGeom prst="rect"/>
                   </pic:spPr>
@@ -95,7 +95,7 @@
         <w:rPr>
           <w:rFonts w:ascii="Calibri" w:hAnsi="Calibri" w:eastAsia="Microsoft YaHei"/>
           <w:b/>
-          <w:color w:val="2E74B5"/>
+          <w:color w:val="111827"/>
           <w:sz w:val="34"/>
         </w:rPr>
         <w:t>流程图 2：Pilot 整批与物理分批判断</w:t>
@@ -109,7 +109,7 @@
       <w:r>
         <w:rPr>
           <w:rFonts w:ascii="Calibri" w:hAnsi="Calibri" w:eastAsia="Microsoft YaHei"/>
-          <w:color w:val="667085"/>
+          <w:color w:val="111827"/>
           <w:sz w:val="19"/>
         </w:rPr>
         <w:t>展示整批条件、分批数量配置校验、Wafer 排序、FOUP 预留及失败回退逻辑。</w:t>
@@ -133,7 +133,7 @@
       <w:r>
         <w:drawing>
           <wp:inline xmlns:a="http://schemas.openxmlformats.org/drawingml/2006/main" xmlns:pic="http://schemas.openxmlformats.org/drawingml/2006/picture">
-            <wp:extent cx="5120640" cy="5831840"/>
+            <wp:extent cx="5623560" cy="6560820"/>
             <wp:docPr id="2" name="Picture 2" descr="流程图 2：Pilot 整批与物理分批判断。展示整批条件、分批数量配置校验、Wafer 排序、FOUP 预留及失败回退逻辑。" title="复杂逻辑流程图（按最终确认规则整理）"/>
             <wp:cNvGraphicFramePr>
               <a:graphicFrameLocks noChangeAspect="1"/>
@@ -154,7 +154,7 @@
                   <pic:spPr>
                     <a:xfrm>
                       <a:off x="0" y="0"/>
-                      <a:ext cx="5120640" cy="5831840"/>
+                      <a:ext cx="5623560" cy="6560820"/>
                     </a:xfrm>
                     <a:prstGeom prst="rect"/>
                   </pic:spPr>
@@ -179,7 +179,7 @@
         <w:rPr>
           <w:rFonts w:ascii="Calibri" w:hAnsi="Calibri" w:eastAsia="Microsoft YaHei"/>
           <w:b/>
-          <w:color w:val="2E74B5"/>
+          <w:color w:val="111827"/>
           <w:sz w:val="34"/>
         </w:rPr>
         <w:t>流程图 3：WaitPilotChangeFOUP 卡控</w:t>
@@ -193,7 +193,7 @@
       <w:r>
         <w:rPr>
           <w:rFonts w:ascii="Calibri" w:hAnsi="Calibri" w:eastAsia="Microsoft YaHei"/>
-          <w:color w:val="667085"/>
+          <w:color w:val="111827"/>
           <w:sz w:val="19"/>
         </w:rPr>
         <w:t>展示 Litho、BARCO 与其他站点在不同 Queue Time 状态下的卡控差异。</w:t>
@@ -217,7 +217,7 @@
       <w:r>
         <w:drawing>
           <wp:inline xmlns:a="http://schemas.openxmlformats.org/drawingml/2006/main" xmlns:pic="http://schemas.openxmlformats.org/drawingml/2006/picture">
-            <wp:extent cx="5212080" cy="5501640"/>
+            <wp:extent cx="5623560" cy="6560820"/>
             <wp:docPr id="3" name="Picture 3" descr="流程图 3：WaitPilotChangeFOUP 卡控。展示 Litho、BARCO 与其他站点在不同 Queue Time 状态下的卡控差异。" title="复杂逻辑流程图（按最终确认规则整理）"/>
             <wp:cNvGraphicFramePr>
               <a:graphicFrameLocks noChangeAspect="1"/>
@@ -238,7 +238,7 @@
                   <pic:spPr>
                     <a:xfrm>
                       <a:off x="0" y="0"/>
-                      <a:ext cx="5212080" cy="5501640"/>
+                      <a:ext cx="5623560" cy="6560820"/>
                     </a:xfrm>
                     <a:prstGeom prst="rect"/>
                   </pic:spPr>
@@ -263,7 +263,7 @@
         <w:rPr>
           <w:rFonts w:ascii="Calibri" w:hAnsi="Calibri" w:eastAsia="Microsoft YaHei"/>
           <w:b/>
-          <w:color w:val="2E74B5"/>
+          <w:color w:val="111827"/>
           <w:sz w:val="34"/>
         </w:rPr>
         <w:t>流程图 4：AMA 物理分批与回退</w:t>
@@ -277,7 +277,7 @@
       <w:r>
         <w:rPr>
           <w:rFonts w:ascii="Calibri" w:hAnsi="Calibri" w:eastAsia="Microsoft YaHei"/>
-          <w:color w:val="667085"/>
+          <w:color w:val="111827"/>
           <w:sz w:val="19"/>
         </w:rPr>
         <w:t>展示分批前置校验、Transfer FOUP、物理分批执行与异常回退处理。</w:t>
@@ -301,7 +301,7 @@
       <w:r>
         <w:drawing>
           <wp:inline xmlns:a="http://schemas.openxmlformats.org/drawingml/2006/main" xmlns:pic="http://schemas.openxmlformats.org/drawingml/2006/picture">
-            <wp:extent cx="5120640" cy="5831840"/>
+            <wp:extent cx="5623560" cy="6560820"/>
             <wp:docPr id="4" name="Picture 4" descr="流程图 4：AMA 物理分批与回退。展示分批前置校验、Transfer FOUP、物理分批执行与异常回退处理。" title="复杂逻辑流程图（按最终确认规则整理）"/>
             <wp:cNvGraphicFramePr>
               <a:graphicFrameLocks noChangeAspect="1"/>
@@ -322,7 +322,7 @@
                   <pic:spPr>
                     <a:xfrm>
                       <a:off x="0" y="0"/>
-                      <a:ext cx="5120640" cy="5831840"/>
+                      <a:ext cx="5623560" cy="6560820"/>
                     </a:xfrm>
                     <a:prstGeom prst="rect"/>
                   </pic:spPr>
@@ -355,7 +355,7 @@
     <w:r>
       <w:rPr>
         <w:rFonts w:ascii="Calibri" w:hAnsi="Calibri" w:eastAsia="Microsoft YaHei"/>
-        <w:color w:val="667085"/>
+        <w:color w:val="111827"/>
         <w:sz w:val="18"/>
       </w:rPr>
       <w:t xml:space="preserve">第 </w:t>
@@ -375,7 +375,7 @@
     <w:r>
       <w:rPr>
         <w:rFonts w:ascii="Calibri" w:hAnsi="Calibri" w:eastAsia="Microsoft YaHei"/>
-        <w:color w:val="667085"/>
+        <w:color w:val="111827"/>
         <w:sz w:val="18"/>
       </w:rPr>
       <w:t xml:space="preserve"> 页</w:t>
@@ -399,7 +399,7 @@
       <w:rPr>
         <w:rFonts w:ascii="Calibri" w:hAnsi="Calibri" w:eastAsia="Microsoft YaHei"/>
         <w:b/>
-        <w:color w:val="667085"/>
+        <w:color w:val="111827"/>
         <w:sz w:val="17"/>
       </w:rPr>
       <w:t>LithoAutoPiRun 复杂逻辑流程图</w:t>
@@ -407,7 +407,7 @@
     <w:r>
       <w:rPr>
         <w:rFonts w:ascii="Calibri" w:hAnsi="Calibri" w:eastAsia="Microsoft YaHei"/>
-        <w:color w:val="667085"/>
+        <w:color w:val="111827"/>
         <w:sz w:val="17"/>
       </w:rPr>
       <w:tab/>

</xml_diff>